<commit_message>
vpscreen-rerank: vpscreen-rerank: 6 recently-analyzed stocks repositioned (solex/omnitech/raghav/sacheerome to screenedOut; capacite/kp-energy in tierC); confluence100+rs1l allocation rebuilt
Co-Authored-By: Claude Sonnet 5 <noreply@anthropic.com>
</commit_message>
<xml_diff>
--- a/projects/valuepickr-open-screen/docs/00d_EXPECTATION_GAP_RANKING.docx
+++ b/projects/valuepickr-open-screen/docs/00d_EXPECTATION_GAP_RANKING.docx
@@ -32,7 +32,7 @@
           <w:sz w:val="20"/>
           <w:szCs w:val="20"/>
         </w:rPr>
-        <w:t xml:space="preserve">Compiled 2026-09-22 · 265 guidance-assessed, 621 researched but not yet assessed</w:t>
+        <w:t xml:space="preserve">Compiled 2026-09-26 · 265 guidance-assessed, 621 researched but not yet assessed</w:t>
       </w:r>
     </w:p>
     <w:p>
@@ -3420,7 +3420,7 @@
                 <w:sz w:val="18"/>
                 <w:szCs w:val="18"/>
               </w:rPr>
-              <w:t xml:space="preserve">42.8</w:t>
+              <w:t xml:space="preserve">41.48</w:t>
             </w:r>
           </w:p>
         </w:tc>
@@ -5909,7 +5909,7 @@
                 <w:sz w:val="18"/>
                 <w:szCs w:val="18"/>
               </w:rPr>
-              <w:t xml:space="preserve">39.8</w:t>
+              <w:t xml:space="preserve">37.05</w:t>
             </w:r>
           </w:p>
         </w:tc>
@@ -6040,7 +6040,7 @@
                 <w:sz w:val="18"/>
                 <w:szCs w:val="18"/>
               </w:rPr>
-              <w:t xml:space="preserve">39.8</w:t>
+              <w:t xml:space="preserve">37.05</w:t>
             </w:r>
           </w:p>
         </w:tc>
@@ -9577,7 +9577,7 @@
                 <w:sz w:val="18"/>
                 <w:szCs w:val="18"/>
               </w:rPr>
-              <w:t xml:space="preserve">40.25</w:t>
+              <w:t xml:space="preserve">31.25</w:t>
             </w:r>
           </w:p>
         </w:tc>
@@ -10494,7 +10494,7 @@
                 <w:sz w:val="18"/>
                 <w:szCs w:val="18"/>
               </w:rPr>
-              <w:t xml:space="preserve">57.95</w:t>
+              <w:t xml:space="preserve">59.62</w:t>
             </w:r>
           </w:p>
         </w:tc>
@@ -14424,7 +14424,7 @@
                 <w:sz w:val="18"/>
                 <w:szCs w:val="18"/>
               </w:rPr>
-              <w:t xml:space="preserve">27.65</w:t>
+              <w:t xml:space="preserve">27.34</w:t>
             </w:r>
           </w:p>
         </w:tc>
@@ -21629,7 +21629,7 @@
                 <w:sz w:val="18"/>
                 <w:szCs w:val="18"/>
               </w:rPr>
-              <w:t xml:space="preserve">25.22</w:t>
+              <w:t xml:space="preserve">23.9</w:t>
             </w:r>
           </w:p>
         </w:tc>
@@ -23332,7 +23332,7 @@
                 <w:sz w:val="18"/>
                 <w:szCs w:val="18"/>
               </w:rPr>
-              <w:t xml:space="preserve">20.65</w:t>
+              <w:t xml:space="preserve">23.12</w:t>
             </w:r>
           </w:p>
         </w:tc>
@@ -24380,7 +24380,7 @@
                 <w:sz w:val="18"/>
                 <w:szCs w:val="18"/>
               </w:rPr>
-              <w:t xml:space="preserve">28.25</w:t>
+              <w:t xml:space="preserve">11.25</w:t>
             </w:r>
           </w:p>
         </w:tc>
@@ -24773,7 +24773,7 @@
                 <w:sz w:val="18"/>
                 <w:szCs w:val="18"/>
               </w:rPr>
-              <w:t xml:space="preserve">43.15</w:t>
+              <w:t xml:space="preserve">45.62</w:t>
             </w:r>
           </w:p>
         </w:tc>
@@ -26590,7 +26590,7 @@
                 <w:sz w:val="18"/>
                 <w:szCs w:val="18"/>
               </w:rPr>
-              <w:t xml:space="preserve">Yatharth Hospital &amp; Trauma Care Services Limited</w:t>
+              <w:t xml:space="preserve">Acutaas Chemicals Ltd (Erst. Ami Organics Ltd)</w:t>
             </w:r>
           </w:p>
         </w:tc>
@@ -26609,7 +26609,7 @@
                 <w:sz w:val="18"/>
                 <w:szCs w:val="18"/>
               </w:rPr>
-              <w:t xml:space="preserve">42.35</w:t>
+              <w:t xml:space="preserve">44.47</w:t>
             </w:r>
           </w:p>
         </w:tc>
@@ -26646,7 +26646,7 @@
                 <w:sz w:val="18"/>
                 <w:szCs w:val="18"/>
               </w:rPr>
-              <w:t xml:space="preserve">no-edge</w:t>
+              <w:t xml:space="preserve">no-edge, no-catalyst</w:t>
             </w:r>
           </w:p>
         </w:tc>
@@ -26664,7 +26664,7 @@
                 <w:sz w:val="18"/>
                 <w:szCs w:val="18"/>
               </w:rPr>
-              <w:t xml:space="preserve">margin · Resolution of the Advent/Aster controlling-stake reports (a firm deal or a clear end to talks); plus Gurugram commissioning Q1 FY28 and the Model Town breakeven (H2 FY27)</w:t>
+              <w:t xml:space="preserve">new_business · no catalyst</w:t>
             </w:r>
           </w:p>
         </w:tc>
@@ -26684,7 +26684,7 @@
                 <w:sz w:val="18"/>
                 <w:szCs w:val="18"/>
               </w:rPr>
-              <w:t xml:space="preserve">Vimta Labs Ltd</w:t>
+              <w:t xml:space="preserve">Yatharth Hospital &amp; Trauma Care Services Limited</w:t>
             </w:r>
           </w:p>
         </w:tc>
@@ -26703,7 +26703,7 @@
                 <w:sz w:val="18"/>
                 <w:szCs w:val="18"/>
               </w:rPr>
-              <w:t xml:space="preserve">40.71</w:t>
+              <w:t xml:space="preserve">42.35</w:t>
             </w:r>
           </w:p>
         </w:tc>
@@ -26758,7 +26758,7 @@
                 <w:sz w:val="18"/>
                 <w:szCs w:val="18"/>
               </w:rPr>
-              <w:t xml:space="preserve">timing · A FY27 quarter showing clinical-research revenue growth reaccelerating toward the 20-25% target (NDCT throughput visible in the numbers)</w:t>
+              <w:t xml:space="preserve">margin · Resolution of the Advent/Aster controlling-stake reports (a firm deal or a clear end to talks); plus Gurugram commissioning Q1 FY28 and the Model Town breakeven (H2 FY27)</w:t>
             </w:r>
           </w:p>
         </w:tc>
@@ -26778,7 +26778,7 @@
                 <w:sz w:val="18"/>
                 <w:szCs w:val="18"/>
               </w:rPr>
-              <w:t xml:space="preserve">Acutaas Chemicals Ltd (Erst. Ami Organics Ltd)</w:t>
+              <w:t xml:space="preserve">Vimta Labs Ltd</w:t>
             </w:r>
           </w:p>
         </w:tc>
@@ -26797,7 +26797,7 @@
                 <w:sz w:val="18"/>
                 <w:szCs w:val="18"/>
               </w:rPr>
-              <w:t xml:space="preserve">39.27</w:t>
+              <w:t xml:space="preserve">40.71</w:t>
             </w:r>
           </w:p>
         </w:tc>
@@ -26834,7 +26834,7 @@
                 <w:sz w:val="18"/>
                 <w:szCs w:val="18"/>
               </w:rPr>
-              <w:t xml:space="preserve">no-edge, no-catalyst</w:t>
+              <w:t xml:space="preserve">no-edge</w:t>
             </w:r>
           </w:p>
         </w:tc>
@@ -26852,7 +26852,7 @@
                 <w:sz w:val="18"/>
                 <w:szCs w:val="18"/>
               </w:rPr>
-              <w:t xml:space="preserve">new_business · no catalyst</w:t>
+              <w:t xml:space="preserve">timing · A FY27 quarter showing clinical-research revenue growth reaccelerating toward the 20-25% target (NDCT throughput visible in the numbers)</w:t>
             </w:r>
           </w:p>
         </w:tc>
@@ -28188,7 +28188,7 @@
                 <w:sz w:val="18"/>
                 <w:szCs w:val="18"/>
               </w:rPr>
-              <w:t xml:space="preserve">SBCL</w:t>
+              <w:t xml:space="preserve">Garware Hi-Tech Films Ltd</w:t>
             </w:r>
           </w:p>
         </w:tc>
@@ -28207,7 +28207,7 @@
                 <w:sz w:val="18"/>
                 <w:szCs w:val="18"/>
               </w:rPr>
-              <w:t xml:space="preserve">26.75</w:t>
+              <w:t xml:space="preserve">27.12</w:t>
             </w:r>
           </w:p>
         </w:tc>
@@ -28244,7 +28244,7 @@
                 <w:sz w:val="18"/>
                 <w:szCs w:val="18"/>
               </w:rPr>
-              <w:t xml:space="preserve">no-edge, no-catalyst</w:t>
+              <w:t xml:space="preserve">no-edge</w:t>
             </w:r>
           </w:p>
         </w:tc>
@@ -28262,7 +28262,7 @@
                 <w:sz w:val="18"/>
                 <w:szCs w:val="18"/>
               </w:rPr>
-              <w:t xml:space="preserve">margin · no catalyst</w:t>
+              <w:t xml:space="preserve">margin · TPU line commissioning (Q3FY27) plus a Q2/Q3FY27 print showing the tariff-normalised margin and new PPF line utilisation recovery</w:t>
             </w:r>
           </w:p>
         </w:tc>
@@ -28282,7 +28282,7 @@
                 <w:sz w:val="18"/>
                 <w:szCs w:val="18"/>
               </w:rPr>
-              <w:t xml:space="preserve">Vikram Thermo</w:t>
+              <w:t xml:space="preserve">SBCL</w:t>
             </w:r>
           </w:p>
         </w:tc>
@@ -28301,7 +28301,7 @@
                 <w:sz w:val="18"/>
                 <w:szCs w:val="18"/>
               </w:rPr>
-              <w:t xml:space="preserve">26.65</w:t>
+              <w:t xml:space="preserve">26.75</w:t>
             </w:r>
           </w:p>
         </w:tc>
@@ -28338,7 +28338,7 @@
                 <w:sz w:val="18"/>
                 <w:szCs w:val="18"/>
               </w:rPr>
-              <w:t xml:space="preserve">no-edge</w:t>
+              <w:t xml:space="preserve">no-edge, no-catalyst</w:t>
             </w:r>
           </w:p>
         </w:tc>
@@ -28356,7 +28356,7 @@
                 <w:sz w:val="18"/>
                 <w:szCs w:val="18"/>
               </w:rPr>
-              <w:t xml:space="preserve">margin · Q2/Q3 FY27 prints showing whether ~45% EBITDA margin and the Q1 revenue step-up hold; any filed confirmation of the mooted US (Barentz) distribution tie-up or a growth-capex announcement</w:t>
+              <w:t xml:space="preserve">margin · no catalyst</w:t>
             </w:r>
           </w:p>
         </w:tc>
@@ -28376,7 +28376,7 @@
                 <w:sz w:val="18"/>
                 <w:szCs w:val="18"/>
               </w:rPr>
-              <w:t xml:space="preserve">Unimech Aerospace and Manufacturing Ltd</w:t>
+              <w:t xml:space="preserve">Vikram Thermo</w:t>
             </w:r>
           </w:p>
         </w:tc>
@@ -28450,7 +28450,7 @@
                 <w:sz w:val="18"/>
                 <w:szCs w:val="18"/>
               </w:rPr>
-              <w:t xml:space="preserve">new_business · First nuclear-order execution prints in H2FY27 + full-quarter Hobel contribution from Q2 + QIP completion / MPS sell-down clearing the overhang</w:t>
+              <w:t xml:space="preserve">margin · Q2/Q3 FY27 prints showing whether ~45% EBITDA margin and the Q1 revenue step-up hold; any filed confirmation of the mooted US (Barentz) distribution tie-up or a growth-capex announcement</w:t>
             </w:r>
           </w:p>
         </w:tc>
@@ -28470,7 +28470,7 @@
                 <w:sz w:val="18"/>
                 <w:szCs w:val="18"/>
               </w:rPr>
-              <w:t xml:space="preserve">ESDS Software Solution Ltd</w:t>
+              <w:t xml:space="preserve">Unimech Aerospace and Manufacturing Ltd</w:t>
             </w:r>
           </w:p>
         </w:tc>
@@ -28489,7 +28489,7 @@
                 <w:sz w:val="18"/>
                 <w:szCs w:val="18"/>
               </w:rPr>
-              <w:t xml:space="preserve">26.25</w:t>
+              <w:t xml:space="preserve">26.65</w:t>
             </w:r>
           </w:p>
         </w:tc>
@@ -28544,7 +28544,7 @@
                 <w:sz w:val="18"/>
                 <w:szCs w:val="18"/>
               </w:rPr>
-              <w:t xml:space="preserve">duration · First post-listing quarterly result (Q2 FY27) and emergence of independent/VP coverage</w:t>
+              <w:t xml:space="preserve">new_business · First nuclear-order execution prints in H2FY27 + full-quarter Hobel contribution from Q2 + QIP completion / MPS sell-down clearing the overhang</w:t>
             </w:r>
           </w:p>
         </w:tc>
@@ -28564,7 +28564,7 @@
                 <w:sz w:val="18"/>
                 <w:szCs w:val="18"/>
               </w:rPr>
-              <w:t xml:space="preserve">Sudeep Pharma Ltd</w:t>
+              <w:t xml:space="preserve">ESDS Software Solution Ltd</w:t>
             </w:r>
           </w:p>
         </w:tc>
@@ -28583,7 +28583,7 @@
                 <w:sz w:val="18"/>
                 <w:szCs w:val="18"/>
               </w:rPr>
-              <w:t xml:space="preserve">25.75</w:t>
+              <w:t xml:space="preserve">26.25</w:t>
             </w:r>
           </w:p>
         </w:tc>
@@ -28620,7 +28620,7 @@
                 <w:sz w:val="18"/>
                 <w:szCs w:val="18"/>
               </w:rPr>
-              <w:t xml:space="preserve">no-edge, no-catalyst</w:t>
+              <w:t xml:space="preserve">no-edge</w:t>
             </w:r>
           </w:p>
         </w:tc>
@@ -28638,7 +28638,7 @@
                 <w:sz w:val="18"/>
                 <w:szCs w:val="18"/>
               </w:rPr>
-              <w:t xml:space="preserve">new_business · no catalyst</w:t>
+              <w:t xml:space="preserve">duration · First post-listing quarterly result (Q2 FY27) and emergence of independent/VP coverage</w:t>
             </w:r>
           </w:p>
         </w:tc>
@@ -28658,7 +28658,7 @@
                 <w:sz w:val="18"/>
                 <w:szCs w:val="18"/>
               </w:rPr>
-              <w:t xml:space="preserve">Sansera Engineering Ltd</w:t>
+              <w:t xml:space="preserve">Sudeep Pharma Ltd</w:t>
             </w:r>
           </w:p>
         </w:tc>
@@ -28677,7 +28677,7 @@
                 <w:sz w:val="18"/>
                 <w:szCs w:val="18"/>
               </w:rPr>
-              <w:t xml:space="preserve">25.25</w:t>
+              <w:t xml:space="preserve">25.75</w:t>
             </w:r>
           </w:p>
         </w:tc>
@@ -28752,7 +28752,7 @@
                 <w:sz w:val="18"/>
                 <w:szCs w:val="18"/>
               </w:rPr>
-              <w:t xml:space="preserve">AGI Infra Ltd</w:t>
+              <w:t xml:space="preserve">Sansera Engineering Ltd</w:t>
             </w:r>
           </w:p>
         </w:tc>
@@ -28771,7 +28771,7 @@
                 <w:sz w:val="18"/>
                 <w:szCs w:val="18"/>
               </w:rPr>
-              <w:t xml:space="preserve">25.06</w:t>
+              <w:t xml:space="preserve">25.25</w:t>
             </w:r>
           </w:p>
         </w:tc>
@@ -28808,7 +28808,7 @@
                 <w:sz w:val="18"/>
                 <w:szCs w:val="18"/>
               </w:rPr>
-              <w:t xml:space="preserve">no-edge</w:t>
+              <w:t xml:space="preserve">no-edge, no-catalyst</w:t>
             </w:r>
           </w:p>
         </w:tc>
@@ -28826,7 +28826,7 @@
                 <w:sz w:val="18"/>
                 <w:szCs w:val="18"/>
               </w:rPr>
-              <w:t xml:space="preserve">timing · FY26-30 pipeline launches landing on schedule plus a quarter showing reported revenue re-acceleration from ongoing-project handovers</w:t>
+              <w:t xml:space="preserve">new_business · no catalyst</w:t>
             </w:r>
           </w:p>
         </w:tc>
@@ -28846,7 +28846,7 @@
                 <w:sz w:val="18"/>
                 <w:szCs w:val="18"/>
               </w:rPr>
-              <w:t xml:space="preserve">Ratnaveer precision a newly headed steel company</w:t>
+              <w:t xml:space="preserve">AGI Infra Ltd</w:t>
             </w:r>
           </w:p>
         </w:tc>
@@ -28865,7 +28865,7 @@
                 <w:sz w:val="18"/>
                 <w:szCs w:val="18"/>
               </w:rPr>
-              <w:t xml:space="preserve">25</w:t>
+              <w:t xml:space="preserve">25.06</w:t>
             </w:r>
           </w:p>
         </w:tc>
@@ -28920,7 +28920,7 @@
                 <w:sz w:val="18"/>
                 <w:szCs w:val="18"/>
               </w:rPr>
-              <w:t xml:space="preserve">new_business · CCL plant commercial production start (targeted Nov 2026) + the first 1-2 quarters of CCL output showing volume and margin</w:t>
+              <w:t xml:space="preserve">timing · FY26-30 pipeline launches landing on schedule plus a quarter showing reported revenue re-acceleration from ongoing-project handovers</w:t>
             </w:r>
           </w:p>
         </w:tc>
@@ -28940,7 +28940,7 @@
                 <w:sz w:val="18"/>
                 <w:szCs w:val="18"/>
               </w:rPr>
-              <w:t xml:space="preserve">Syrma SGS an Export Substitution opportunity in EMS sector</w:t>
+              <w:t xml:space="preserve">Ratnaveer precision a newly headed steel company</w:t>
             </w:r>
           </w:p>
         </w:tc>
@@ -28959,7 +28959,7 @@
                 <w:sz w:val="18"/>
                 <w:szCs w:val="18"/>
               </w:rPr>
-              <w:t xml:space="preserve">24.83</w:t>
+              <w:t xml:space="preserve">25</w:t>
             </w:r>
           </w:p>
         </w:tc>
@@ -28996,7 +28996,7 @@
                 <w:sz w:val="18"/>
                 <w:szCs w:val="18"/>
               </w:rPr>
-              <w:t xml:space="preserve">no-edge, no-catalyst</w:t>
+              <w:t xml:space="preserve">no-edge</w:t>
             </w:r>
           </w:p>
         </w:tc>
@@ -29014,7 +29014,7 @@
                 <w:sz w:val="18"/>
                 <w:szCs w:val="18"/>
               </w:rPr>
-              <w:t xml:space="preserve">margin · no catalyst</w:t>
+              <w:t xml:space="preserve">new_business · CCL plant commercial production start (targeted Nov 2026) + the first 1-2 quarters of CCL output showing volume and margin</w:t>
             </w:r>
           </w:p>
         </w:tc>
@@ -29034,7 +29034,7 @@
                 <w:sz w:val="18"/>
                 <w:szCs w:val="18"/>
               </w:rPr>
-              <w:t xml:space="preserve">Sarda Energy &amp; Minerals Ltd (SEML)</w:t>
+              <w:t xml:space="preserve">Syrma SGS an Export Substitution opportunity in EMS sector</w:t>
             </w:r>
           </w:p>
         </w:tc>
@@ -29053,7 +29053,7 @@
                 <w:sz w:val="18"/>
                 <w:szCs w:val="18"/>
               </w:rPr>
-              <w:t xml:space="preserve">24.75</w:t>
+              <w:t xml:space="preserve">24.83</w:t>
             </w:r>
           </w:p>
         </w:tc>
@@ -29128,7 +29128,7 @@
                 <w:sz w:val="18"/>
                 <w:szCs w:val="18"/>
               </w:rPr>
-              <w:t xml:space="preserve">Garware Hi-Tech Films Ltd</w:t>
+              <w:t xml:space="preserve">Sarda Energy &amp; Minerals Ltd (SEML)</w:t>
             </w:r>
           </w:p>
         </w:tc>
@@ -29147,7 +29147,7 @@
                 <w:sz w:val="18"/>
                 <w:szCs w:val="18"/>
               </w:rPr>
-              <w:t xml:space="preserve">24.65</w:t>
+              <w:t xml:space="preserve">24.75</w:t>
             </w:r>
           </w:p>
         </w:tc>
@@ -29184,7 +29184,7 @@
                 <w:sz w:val="18"/>
                 <w:szCs w:val="18"/>
               </w:rPr>
-              <w:t xml:space="preserve">no-edge</w:t>
+              <w:t xml:space="preserve">no-edge, no-catalyst</w:t>
             </w:r>
           </w:p>
         </w:tc>
@@ -29202,7 +29202,7 @@
                 <w:sz w:val="18"/>
                 <w:szCs w:val="18"/>
               </w:rPr>
-              <w:t xml:space="preserve">margin · TPU line commissioning (Q3FY27) plus a Q2/Q3FY27 print showing the tariff-normalised margin and new PPF line utilisation recovery</w:t>
+              <w:t xml:space="preserve">margin · no catalyst</w:t>
             </w:r>
           </w:p>
         </w:tc>
@@ -29786,7 +29786,7 @@
                 <w:sz w:val="18"/>
                 <w:szCs w:val="18"/>
               </w:rPr>
-              <w:t xml:space="preserve">Axiscades Engineering</w:t>
+              <w:t xml:space="preserve">Archit Nuwood Industries</w:t>
             </w:r>
           </w:p>
         </w:tc>
@@ -29805,7 +29805,7 @@
                 <w:sz w:val="18"/>
                 <w:szCs w:val="18"/>
               </w:rPr>
-              <w:t xml:space="preserve">19.04</w:t>
+              <w:t xml:space="preserve">19</w:t>
             </w:r>
           </w:p>
         </w:tc>
@@ -29860,7 +29860,7 @@
                 <w:sz w:val="18"/>
                 <w:szCs w:val="18"/>
               </w:rPr>
-              <w:t xml:space="preserve">timing · Q2/Q3 FY27 prints from the pure-play continuing entity showing defence revenue +75% and margin recovering off 11.8%, plus Devanahalli Atmanirbhar Complex Phase 1 commissioning</w:t>
+              <w:t xml:space="preserve">margin · FY26 annual report / cash-flow statement - the key test of whether the 9M FY26 margin recovery is accompanied by normalised operating cash flow and working-capital days, or whether the FY24-style cash-conversion problem persists</w:t>
             </w:r>
           </w:p>
         </w:tc>
@@ -29880,7 +29880,7 @@
                 <w:sz w:val="18"/>
                 <w:szCs w:val="18"/>
               </w:rPr>
-              <w:t xml:space="preserve">Archit Nuwood Industries</w:t>
+              <w:t xml:space="preserve">Sasken Technologies Ltd</w:t>
             </w:r>
           </w:p>
         </w:tc>
@@ -29899,7 +29899,7 @@
                 <w:sz w:val="18"/>
                 <w:szCs w:val="18"/>
               </w:rPr>
-              <w:t xml:space="preserve">19</w:t>
+              <w:t xml:space="preserve">18.7</w:t>
             </w:r>
           </w:p>
         </w:tc>
@@ -29954,7 +29954,7 @@
                 <w:sz w:val="18"/>
                 <w:szCs w:val="18"/>
               </w:rPr>
-              <w:t xml:space="preserve">margin · FY26 annual report / cash-flow statement - the key test of whether the 9M FY26 margin recovery is accompanied by normalised operating cash flow and working-capital days, or whether the FY24-style cash-conversion problem persists</w:t>
+              <w:t xml:space="preserve">margin · Q2-Q3 FY27 prints showing organic growth held above 20% AND EBITDA margin stepping toward low-teens (not merely holding ~9.5%)</w:t>
             </w:r>
           </w:p>
         </w:tc>
@@ -29974,7 +29974,7 @@
                 <w:sz w:val="18"/>
                 <w:szCs w:val="18"/>
               </w:rPr>
-              <w:t xml:space="preserve">Sasken Technologies Ltd</w:t>
+              <w:t xml:space="preserve">SML Isuzu Ltd</w:t>
             </w:r>
           </w:p>
         </w:tc>
@@ -29993,7 +29993,7 @@
                 <w:sz w:val="18"/>
                 <w:szCs w:val="18"/>
               </w:rPr>
-              <w:t xml:space="preserve">18.7</w:t>
+              <w:t xml:space="preserve">18.15</w:t>
             </w:r>
           </w:p>
         </w:tc>
@@ -30048,7 +30048,7 @@
                 <w:sz w:val="18"/>
                 <w:szCs w:val="18"/>
               </w:rPr>
-              <w:t xml:space="preserve">margin · Q2-Q3 FY27 prints showing organic growth held above 20% AND EBITDA margin stepping toward low-teens (not merely holding ~9.5%)</w:t>
+              <w:t xml:space="preserve">margin · A quarter showing EBITDA margin recovery above 12% plus tangible M&amp;M product / distribution synergies</w:t>
             </w:r>
           </w:p>
         </w:tc>
@@ -30068,7 +30068,7 @@
                 <w:sz w:val="18"/>
                 <w:szCs w:val="18"/>
               </w:rPr>
-              <w:t xml:space="preserve">SML Isuzu Ltd</w:t>
+              <w:t xml:space="preserve">Axiscades Engineering</w:t>
             </w:r>
           </w:p>
         </w:tc>
@@ -30087,7 +30087,7 @@
                 <w:sz w:val="18"/>
                 <w:szCs w:val="18"/>
               </w:rPr>
-              <w:t xml:space="preserve">18.15</w:t>
+              <w:t xml:space="preserve">18.09</w:t>
             </w:r>
           </w:p>
         </w:tc>
@@ -30142,7 +30142,7 @@
                 <w:sz w:val="18"/>
                 <w:szCs w:val="18"/>
               </w:rPr>
-              <w:t xml:space="preserve">margin · A quarter showing EBITDA margin recovery above 12% plus tangible M&amp;M product / distribution synergies</w:t>
+              <w:t xml:space="preserve">timing · Q2/Q3 FY27 prints from the pure-play continuing entity showing defence revenue +75% and margin recovering off 11.8%, plus Devanahalli Atmanirbhar Complex Phase 1 commissioning</w:t>
             </w:r>
           </w:p>
         </w:tc>
@@ -30632,7 +30632,7 @@
                 <w:sz w:val="18"/>
                 <w:szCs w:val="18"/>
               </w:rPr>
-              <w:t xml:space="preserve">Bhagyanagar India Ltd</w:t>
+              <w:t xml:space="preserve">John Cockerill India: A Case Study on Decarbonisation of Steel</w:t>
             </w:r>
           </w:p>
         </w:tc>
@@ -30651,7 +30651,7 @@
                 <w:sz w:val="18"/>
                 <w:szCs w:val="18"/>
               </w:rPr>
-              <w:t xml:space="preserve">16.38</w:t>
+              <w:t xml:space="preserve">15.68</w:t>
             </w:r>
           </w:p>
         </w:tc>
@@ -30706,7 +30706,7 @@
                 <w:sz w:val="18"/>
                 <w:szCs w:val="18"/>
               </w:rPr>
-              <w:t xml:space="preserve">margin · Completion of the NCLT Composite Scheme of Arrangement and separate listing of Tieramet Ltd (copper business demerger)</w:t>
+              <w:t xml:space="preserve">margin · H2 CY26 quarterly print showing an actual EBITDA-margin step-up (management's own guided window)</w:t>
             </w:r>
           </w:p>
         </w:tc>
@@ -30726,7 +30726,7 @@
                 <w:sz w:val="18"/>
                 <w:szCs w:val="18"/>
               </w:rPr>
-              <w:t xml:space="preserve">John Cockerill India: A Case Study on Decarbonisation of Steel</w:t>
+              <w:t xml:space="preserve">Apollo Micro Systems Limited</w:t>
             </w:r>
           </w:p>
         </w:tc>
@@ -30745,7 +30745,7 @@
                 <w:sz w:val="18"/>
                 <w:szCs w:val="18"/>
               </w:rPr>
-              <w:t xml:space="preserve">15.68</w:t>
+              <w:t xml:space="preserve">15.5</w:t>
             </w:r>
           </w:p>
         </w:tc>
@@ -30800,7 +30800,7 @@
                 <w:sz w:val="18"/>
                 <w:szCs w:val="18"/>
               </w:rPr>
-              <w:t xml:space="preserve">margin · H2 CY26 quarterly print showing an actual EBITDA-margin step-up (management's own guided window)</w:t>
+              <w:t xml:space="preserve">duration · MIGM (~Rs 3,500 Cr, ~70% Apollo share) and QRSAM purchase orders expected by end-FY27, plus the first consolidated quarter showing Premier Explosives integration</w:t>
             </w:r>
           </w:p>
         </w:tc>
@@ -30820,7 +30820,7 @@
                 <w:sz w:val="18"/>
                 <w:szCs w:val="18"/>
               </w:rPr>
-              <w:t xml:space="preserve">Apollo Micro Systems Limited</w:t>
+              <w:t xml:space="preserve">Ramco system</w:t>
             </w:r>
           </w:p>
         </w:tc>
@@ -30839,7 +30839,7 @@
                 <w:sz w:val="18"/>
                 <w:szCs w:val="18"/>
               </w:rPr>
-              <w:t xml:space="preserve">15.5</w:t>
+              <w:t xml:space="preserve">15.04</w:t>
             </w:r>
           </w:p>
         </w:tc>
@@ -30894,7 +30894,7 @@
                 <w:sz w:val="18"/>
                 <w:szCs w:val="18"/>
               </w:rPr>
-              <w:t xml:space="preserve">duration · MIGM (~Rs 3,500 Cr, ~70% Apollo share) and QRSAM purchase orders expected by end-FY27, plus the first consolidated quarter showing Premier Explosives integration</w:t>
+              <w:t xml:space="preserve">duration · H2 FY27 prints against LarryWink's three tests: OPM back above ~20%, absolute recurring revenue rising, services revenue stabilising</w:t>
             </w:r>
           </w:p>
         </w:tc>
@@ -30914,7 +30914,7 @@
                 <w:sz w:val="18"/>
                 <w:szCs w:val="18"/>
               </w:rPr>
-              <w:t xml:space="preserve">Ramco system</w:t>
+              <w:t xml:space="preserve">Bhagyanagar India Ltd</w:t>
             </w:r>
           </w:p>
         </w:tc>
@@ -30933,7 +30933,7 @@
                 <w:sz w:val="18"/>
                 <w:szCs w:val="18"/>
               </w:rPr>
-              <w:t xml:space="preserve">15.04</w:t>
+              <w:t xml:space="preserve">15.02</w:t>
             </w:r>
           </w:p>
         </w:tc>
@@ -30988,7 +30988,7 @@
                 <w:sz w:val="18"/>
                 <w:szCs w:val="18"/>
               </w:rPr>
-              <w:t xml:space="preserve">duration · H2 FY27 prints against LarryWink's three tests: OPM back above ~20%, absolute recurring revenue rising, services revenue stabilising</w:t>
+              <w:t xml:space="preserve">margin · Completion of the NCLT Composite Scheme of Arrangement and separate listing of Tieramet Ltd (copper business demerger)</w:t>
             </w:r>
           </w:p>
         </w:tc>
@@ -31215,7 +31215,7 @@
                 <w:sz w:val="18"/>
                 <w:szCs w:val="18"/>
               </w:rPr>
-              <w:t xml:space="preserve">13.81</w:t>
+              <w:t xml:space="preserve">12.65</w:t>
             </w:r>
           </w:p>
         </w:tc>
@@ -32660,7 +32660,7 @@
                 <w:sz w:val="18"/>
                 <w:szCs w:val="18"/>
               </w:rPr>
-              <w:t xml:space="preserve">35.55</w:t>
+              <w:t xml:space="preserve">43.59</w:t>
             </w:r>
           </w:p>
         </w:tc>
@@ -32717,7 +32717,7 @@
                 <w:sz w:val="18"/>
                 <w:szCs w:val="18"/>
               </w:rPr>
-              <w:t xml:space="preserve">Bajaj Consumer Care Ltd</w:t>
+              <w:t xml:space="preserve">CarTrade Tech Ltd</w:t>
             </w:r>
           </w:p>
         </w:tc>
@@ -32736,7 +32736,7 @@
                 <w:sz w:val="18"/>
                 <w:szCs w:val="18"/>
               </w:rPr>
-              <w:t xml:space="preserve">35</w:t>
+              <w:t xml:space="preserve">32.87</w:t>
             </w:r>
           </w:p>
         </w:tc>
@@ -32754,7 +32754,7 @@
                 <w:sz w:val="18"/>
                 <w:szCs w:val="18"/>
               </w:rPr>
-              <w:t xml:space="preserve">Medium-High</w:t>
+              <w:t xml:space="preserve">Medium</w:t>
             </w:r>
           </w:p>
         </w:tc>
@@ -32793,7 +32793,7 @@
                 <w:sz w:val="18"/>
                 <w:szCs w:val="18"/>
               </w:rPr>
-              <w:t xml:space="preserve">CarTrade Tech Ltd</w:t>
+              <w:t xml:space="preserve">Bajaj Consumer Care Ltd</w:t>
             </w:r>
           </w:p>
         </w:tc>
@@ -32812,7 +32812,7 @@
                 <w:sz w:val="18"/>
                 <w:szCs w:val="18"/>
               </w:rPr>
-              <w:t xml:space="preserve">32.87</w:t>
+              <w:t xml:space="preserve">32.25</w:t>
             </w:r>
           </w:p>
         </w:tc>
@@ -32830,7 +32830,7 @@
                 <w:sz w:val="18"/>
                 <w:szCs w:val="18"/>
               </w:rPr>
-              <w:t xml:space="preserve">Medium</w:t>
+              <w:t xml:space="preserve">Medium-High</w:t>
             </w:r>
           </w:p>
         </w:tc>
@@ -32945,7 +32945,7 @@
                 <w:sz w:val="18"/>
                 <w:szCs w:val="18"/>
               </w:rPr>
-              <w:t xml:space="preserve">Transrail Lighting Ltd</w:t>
+              <w:t xml:space="preserve">TruAlt Bioenergy</w:t>
             </w:r>
           </w:p>
         </w:tc>
@@ -32964,7 +32964,7 @@
                 <w:sz w:val="18"/>
                 <w:szCs w:val="18"/>
               </w:rPr>
-              <w:t xml:space="preserve">31.65</w:t>
+              <w:t xml:space="preserve">30</w:t>
             </w:r>
           </w:p>
         </w:tc>
@@ -33021,7 +33021,7 @@
                 <w:sz w:val="18"/>
                 <w:szCs w:val="18"/>
               </w:rPr>
-              <w:t xml:space="preserve">TruAlt Bioenergy</w:t>
+              <w:t xml:space="preserve">Vikram Solar- One of the oldest Solar module manufacturer</w:t>
             </w:r>
           </w:p>
         </w:tc>
@@ -33097,7 +33097,7 @@
                 <w:sz w:val="18"/>
                 <w:szCs w:val="18"/>
               </w:rPr>
-              <w:t xml:space="preserve">Vikram Solar- One of the oldest Solar module manufacturer</w:t>
+              <w:t xml:space="preserve">KP Green Engineering Ltd</w:t>
             </w:r>
           </w:p>
         </w:tc>
@@ -33173,7 +33173,7 @@
                 <w:sz w:val="18"/>
                 <w:szCs w:val="18"/>
               </w:rPr>
-              <w:t xml:space="preserve">KP Green Engineering Ltd</w:t>
+              <w:t xml:space="preserve">Desco Infratech Ltd</w:t>
             </w:r>
           </w:p>
         </w:tc>
@@ -33249,7 +33249,7 @@
                 <w:sz w:val="18"/>
                 <w:szCs w:val="18"/>
               </w:rPr>
-              <w:t xml:space="preserve">Desco Infratech Ltd</w:t>
+              <w:t xml:space="preserve">Oval Projects Engineering Ltd</w:t>
             </w:r>
           </w:p>
         </w:tc>
@@ -33325,7 +33325,7 @@
                 <w:sz w:val="18"/>
                 <w:szCs w:val="18"/>
               </w:rPr>
-              <w:t xml:space="preserve">Oval Projects Engineering Ltd</w:t>
+              <w:t xml:space="preserve">Surya roshni ltd</w:t>
             </w:r>
           </w:p>
         </w:tc>
@@ -33344,7 +33344,7 @@
                 <w:sz w:val="18"/>
                 <w:szCs w:val="18"/>
               </w:rPr>
-              <w:t xml:space="preserve">30</w:t>
+              <w:t xml:space="preserve">29.12</w:t>
             </w:r>
           </w:p>
         </w:tc>
@@ -33362,7 +33362,7 @@
                 <w:sz w:val="18"/>
                 <w:szCs w:val="18"/>
               </w:rPr>
-              <w:t xml:space="preserve">Low-Medium</w:t>
+              <w:t xml:space="preserve">Medium</w:t>
             </w:r>
           </w:p>
         </w:tc>
@@ -33381,7 +33381,7 @@
                 <w:sz w:val="18"/>
                 <w:szCs w:val="18"/>
               </w:rPr>
-              <w:t xml:space="preserve">10x-in-2-3-years</w:t>
+              <w:t xml:space="preserve">neither</w:t>
             </w:r>
           </w:p>
         </w:tc>
@@ -33401,7 +33401,7 @@
                 <w:sz w:val="18"/>
                 <w:szCs w:val="18"/>
               </w:rPr>
-              <w:t xml:space="preserve">Surya roshni ltd</w:t>
+              <w:t xml:space="preserve">Cera Sanitaryware Ltd</w:t>
             </w:r>
           </w:p>
         </w:tc>
@@ -33477,7 +33477,7 @@
                 <w:sz w:val="18"/>
                 <w:szCs w:val="18"/>
               </w:rPr>
-              <w:t xml:space="preserve">Cera Sanitaryware Ltd</w:t>
+              <w:t xml:space="preserve">Quality Power Electrical Equipments Ltd (QPOWER)</w:t>
             </w:r>
           </w:p>
         </w:tc>
@@ -33496,7 +33496,7 @@
                 <w:sz w:val="18"/>
                 <w:szCs w:val="18"/>
               </w:rPr>
-              <w:t xml:space="preserve">29.12</w:t>
+              <w:t xml:space="preserve">28.6</w:t>
             </w:r>
           </w:p>
         </w:tc>
@@ -33553,7 +33553,7 @@
                 <w:sz w:val="18"/>
                 <w:szCs w:val="18"/>
               </w:rPr>
-              <w:t xml:space="preserve">Quality Power Electrical Equipments Ltd (QPOWER)</w:t>
+              <w:t xml:space="preserve">Hero Motor</w:t>
             </w:r>
           </w:p>
         </w:tc>
@@ -33572,7 +33572,7 @@
                 <w:sz w:val="18"/>
                 <w:szCs w:val="18"/>
               </w:rPr>
-              <w:t xml:space="preserve">28.6</w:t>
+              <w:t xml:space="preserve">28.4</w:t>
             </w:r>
           </w:p>
         </w:tc>
@@ -33629,7 +33629,7 @@
                 <w:sz w:val="18"/>
                 <w:szCs w:val="18"/>
               </w:rPr>
-              <w:t xml:space="preserve">Hero Motor</w:t>
+              <w:t xml:space="preserve">Le Travenues Technology Ltd (ixigo)</w:t>
             </w:r>
           </w:p>
         </w:tc>
@@ -33648,7 +33648,7 @@
                 <w:sz w:val="18"/>
                 <w:szCs w:val="18"/>
               </w:rPr>
-              <w:t xml:space="preserve">28.4</w:t>
+              <w:t xml:space="preserve">28.3</w:t>
             </w:r>
           </w:p>
         </w:tc>
@@ -33705,7 +33705,7 @@
                 <w:sz w:val="18"/>
                 <w:szCs w:val="18"/>
               </w:rPr>
-              <w:t xml:space="preserve">Le Travenues Technology Ltd (ixigo)</w:t>
+              <w:t xml:space="preserve">Sterlite Technologies Ltd (STLTECH) | Digital India play</w:t>
             </w:r>
           </w:p>
         </w:tc>
@@ -33724,7 +33724,7 @@
                 <w:sz w:val="18"/>
                 <w:szCs w:val="18"/>
               </w:rPr>
-              <w:t xml:space="preserve">28.3</w:t>
+              <w:t xml:space="preserve">28.21</w:t>
             </w:r>
           </w:p>
         </w:tc>
@@ -33781,7 +33781,7 @@
                 <w:sz w:val="18"/>
                 <w:szCs w:val="18"/>
               </w:rPr>
-              <w:t xml:space="preserve">Sterlite Technologies Ltd (STLTECH) | Digital India play</w:t>
+              <w:t xml:space="preserve">RPG Life Sciences Ltd</w:t>
             </w:r>
           </w:p>
         </w:tc>
@@ -33800,7 +33800,7 @@
                 <w:sz w:val="18"/>
                 <w:szCs w:val="18"/>
               </w:rPr>
-              <w:t xml:space="preserve">28.21</w:t>
+              <w:t xml:space="preserve">27.7</w:t>
             </w:r>
           </w:p>
         </w:tc>
@@ -33857,7 +33857,7 @@
                 <w:sz w:val="18"/>
                 <w:szCs w:val="18"/>
               </w:rPr>
-              <w:t xml:space="preserve">RPG Life Sciences Ltd</w:t>
+              <w:t xml:space="preserve">Avanti Feeds Ltd</w:t>
             </w:r>
           </w:p>
         </w:tc>
@@ -33876,7 +33876,7 @@
                 <w:sz w:val="18"/>
                 <w:szCs w:val="18"/>
               </w:rPr>
-              <w:t xml:space="preserve">27.7</w:t>
+              <w:t xml:space="preserve">27.06</w:t>
             </w:r>
           </w:p>
         </w:tc>
@@ -33933,7 +33933,7 @@
                 <w:sz w:val="18"/>
                 <w:szCs w:val="18"/>
               </w:rPr>
-              <w:t xml:space="preserve">Avanti Feeds Ltd</w:t>
+              <w:t xml:space="preserve">Sandhar Technologies Ltd</w:t>
             </w:r>
           </w:p>
         </w:tc>
@@ -34009,7 +34009,7 @@
                 <w:sz w:val="18"/>
                 <w:szCs w:val="18"/>
               </w:rPr>
-              <w:t xml:space="preserve">Sandhar Technologies Ltd</w:t>
+              <w:t xml:space="preserve">Transrail Lighting Ltd</w:t>
             </w:r>
           </w:p>
         </w:tc>
@@ -34028,7 +34028,7 @@
                 <w:sz w:val="18"/>
                 <w:szCs w:val="18"/>
               </w:rPr>
-              <w:t xml:space="preserve">27.06</w:t>
+              <w:t xml:space="preserve">26.65</w:t>
             </w:r>
           </w:p>
         </w:tc>
@@ -34313,7 +34313,7 @@
                 <w:sz w:val="18"/>
                 <w:szCs w:val="18"/>
               </w:rPr>
-              <w:t xml:space="preserve">Tips Industries Limited</w:t>
+              <w:t xml:space="preserve">Uno Minda Ltd</w:t>
             </w:r>
           </w:p>
         </w:tc>
@@ -34332,7 +34332,7 @@
                 <w:sz w:val="18"/>
                 <w:szCs w:val="18"/>
               </w:rPr>
-              <w:t xml:space="preserve">25.34</w:t>
+              <w:t xml:space="preserve">25.49</w:t>
             </w:r>
           </w:p>
         </w:tc>
@@ -34350,7 +34350,7 @@
                 <w:sz w:val="18"/>
                 <w:szCs w:val="18"/>
               </w:rPr>
-              <w:t xml:space="preserve">Medium</w:t>
+              <w:t xml:space="preserve">Low-Medium</w:t>
             </w:r>
           </w:p>
         </w:tc>
@@ -34389,7 +34389,7 @@
                 <w:sz w:val="18"/>
                 <w:szCs w:val="18"/>
               </w:rPr>
-              <w:t xml:space="preserve">Heritage Foods Ltd</w:t>
+              <w:t xml:space="preserve">Tips Industries Limited</w:t>
             </w:r>
           </w:p>
         </w:tc>
@@ -34465,7 +34465,7 @@
                 <w:sz w:val="18"/>
                 <w:szCs w:val="18"/>
               </w:rPr>
-              <w:t xml:space="preserve">Amara Raja Energy &amp; Mobility Ltd</w:t>
+              <w:t xml:space="preserve">Heritage Foods Ltd</w:t>
             </w:r>
           </w:p>
         </w:tc>
@@ -34541,7 +34541,7 @@
                 <w:sz w:val="18"/>
                 <w:szCs w:val="18"/>
               </w:rPr>
-              <w:t xml:space="preserve">Solar Industries India Ltd</w:t>
+              <w:t xml:space="preserve">Amara Raja Energy &amp; Mobility Ltd</w:t>
             </w:r>
           </w:p>
         </w:tc>
@@ -34560,7 +34560,7 @@
                 <w:sz w:val="18"/>
                 <w:szCs w:val="18"/>
               </w:rPr>
-              <w:t xml:space="preserve">25.17</w:t>
+              <w:t xml:space="preserve">25.34</w:t>
             </w:r>
           </w:p>
         </w:tc>
@@ -34617,7 +34617,7 @@
                 <w:sz w:val="18"/>
                 <w:szCs w:val="18"/>
               </w:rPr>
-              <w:t xml:space="preserve">Genus Power</w:t>
+              <w:t xml:space="preserve">Solar Industries India Ltd</w:t>
             </w:r>
           </w:p>
         </w:tc>
@@ -34636,7 +34636,7 @@
                 <w:sz w:val="18"/>
                 <w:szCs w:val="18"/>
               </w:rPr>
-              <w:t xml:space="preserve">25</w:t>
+              <w:t xml:space="preserve">25.17</w:t>
             </w:r>
           </w:p>
         </w:tc>
@@ -34693,7 +34693,7 @@
                 <w:sz w:val="18"/>
                 <w:szCs w:val="18"/>
               </w:rPr>
-              <w:t xml:space="preserve">Himadri Speciality Chemical Ltd (HSCL)</w:t>
+              <w:t xml:space="preserve">Genus Power</w:t>
             </w:r>
           </w:p>
         </w:tc>
@@ -34769,7 +34769,7 @@
                 <w:sz w:val="18"/>
                 <w:szCs w:val="18"/>
               </w:rPr>
-              <w:t xml:space="preserve">Milky Mist Dairy Food Ltd- Taste meets Valuations?</w:t>
+              <w:t xml:space="preserve">Himadri Speciality Chemical Ltd (HSCL)</w:t>
             </w:r>
           </w:p>
         </w:tc>
@@ -34845,7 +34845,7 @@
                 <w:sz w:val="18"/>
                 <w:szCs w:val="18"/>
               </w:rPr>
-              <w:t xml:space="preserve">Shanthi Gears/Shanti Gears</w:t>
+              <w:t xml:space="preserve">Milky Mist Dairy Food Ltd- Taste meets Valuations?</w:t>
             </w:r>
           </w:p>
         </w:tc>
@@ -34921,7 +34921,7 @@
                 <w:sz w:val="18"/>
                 <w:szCs w:val="18"/>
               </w:rPr>
-              <w:t xml:space="preserve">Triveni Turbines Ltd</w:t>
+              <w:t xml:space="preserve">Shanthi Gears/Shanti Gears</w:t>
             </w:r>
           </w:p>
         </w:tc>
@@ -34997,7 +34997,7 @@
                 <w:sz w:val="18"/>
                 <w:szCs w:val="18"/>
               </w:rPr>
-              <w:t xml:space="preserve">Goldiam International : A rare shareholder friendly and debt free Jewelry company</w:t>
+              <w:t xml:space="preserve">Triveni Turbines Ltd</w:t>
             </w:r>
           </w:p>
         </w:tc>
@@ -35073,7 +35073,7 @@
                 <w:sz w:val="18"/>
                 <w:szCs w:val="18"/>
               </w:rPr>
-              <w:t xml:space="preserve">Rain Industries</w:t>
+              <w:t xml:space="preserve">Goldiam International : A rare shareholder friendly and debt free Jewelry company</w:t>
             </w:r>
           </w:p>
         </w:tc>
@@ -35149,7 +35149,7 @@
                 <w:sz w:val="18"/>
                 <w:szCs w:val="18"/>
               </w:rPr>
-              <w:t xml:space="preserve">Manappuram Finance</w:t>
+              <w:t xml:space="preserve">Rain Industries</w:t>
             </w:r>
           </w:p>
         </w:tc>
@@ -35225,7 +35225,7 @@
                 <w:sz w:val="18"/>
                 <w:szCs w:val="18"/>
               </w:rPr>
-              <w:t xml:space="preserve">Natco Pharma: Focusing On Complex Products</w:t>
+              <w:t xml:space="preserve">Manappuram Finance</w:t>
             </w:r>
           </w:p>
         </w:tc>
@@ -35301,7 +35301,7 @@
                 <w:sz w:val="18"/>
                 <w:szCs w:val="18"/>
               </w:rPr>
-              <w:t xml:space="preserve">Sedemac Mechatronics Ltd</w:t>
+              <w:t xml:space="preserve">Natco Pharma: Focusing On Complex Products</w:t>
             </w:r>
           </w:p>
         </w:tc>
@@ -35377,7 +35377,7 @@
                 <w:sz w:val="18"/>
                 <w:szCs w:val="18"/>
               </w:rPr>
-              <w:t xml:space="preserve">Venus Pipes &amp; Tubes Ltd</w:t>
+              <w:t xml:space="preserve">Sedemac Mechatronics Ltd</w:t>
             </w:r>
           </w:p>
         </w:tc>
@@ -35453,7 +35453,7 @@
                 <w:sz w:val="18"/>
                 <w:szCs w:val="18"/>
               </w:rPr>
-              <w:t xml:space="preserve">Shivalik Bimetal Controls Ltd (SBCL)</w:t>
+              <w:t xml:space="preserve">Venus Pipes &amp; Tubes Ltd</w:t>
             </w:r>
           </w:p>
         </w:tc>
@@ -35529,7 +35529,7 @@
                 <w:sz w:val="18"/>
                 <w:szCs w:val="18"/>
               </w:rPr>
-              <w:t xml:space="preserve">The Anup Engineering Ltd</w:t>
+              <w:t xml:space="preserve">Shivalik Bimetal Controls Ltd (SBCL)</w:t>
             </w:r>
           </w:p>
         </w:tc>
@@ -35605,7 +35605,7 @@
                 <w:sz w:val="18"/>
                 <w:szCs w:val="18"/>
               </w:rPr>
-              <w:t xml:space="preserve">Savita Oil Technologies Ltd: Undervalued midcap in a competitive space?</w:t>
+              <w:t xml:space="preserve">The Anup Engineering Ltd</w:t>
             </w:r>
           </w:p>
         </w:tc>
@@ -35681,7 +35681,7 @@
                 <w:sz w:val="18"/>
                 <w:szCs w:val="18"/>
               </w:rPr>
-              <w:t xml:space="preserve">Avalon Technologies Ltd</w:t>
+              <w:t xml:space="preserve">Savita Oil Technologies Ltd: Undervalued midcap in a competitive space?</w:t>
             </w:r>
           </w:p>
         </w:tc>
@@ -35757,7 +35757,7 @@
                 <w:sz w:val="18"/>
                 <w:szCs w:val="18"/>
               </w:rPr>
-              <w:t xml:space="preserve">Elantas Beck India Ltd</w:t>
+              <w:t xml:space="preserve">Avalon Technologies Ltd</w:t>
             </w:r>
           </w:p>
         </w:tc>
@@ -35833,7 +35833,7 @@
                 <w:sz w:val="18"/>
                 <w:szCs w:val="18"/>
               </w:rPr>
-              <w:t xml:space="preserve">Waaree Renewable Technologies Ltd</w:t>
+              <w:t xml:space="preserve">Elantas Beck India Ltd</w:t>
             </w:r>
           </w:p>
         </w:tc>
@@ -35909,7 +35909,7 @@
                 <w:sz w:val="18"/>
                 <w:szCs w:val="18"/>
               </w:rPr>
-              <w:t xml:space="preserve">Thangmayil jewellers ltd</w:t>
+              <w:t xml:space="preserve">Waaree Renewable Technologies Ltd</w:t>
             </w:r>
           </w:p>
         </w:tc>
@@ -35985,7 +35985,7 @@
                 <w:sz w:val="18"/>
                 <w:szCs w:val="18"/>
               </w:rPr>
-              <w:t xml:space="preserve">Balu Forge | Forging Ahead with Defense and Aerospace Ambitions Amid Capital Efficiency Concerns |</w:t>
+              <w:t xml:space="preserve">Thangmayil jewellers ltd</w:t>
             </w:r>
           </w:p>
         </w:tc>
@@ -36061,7 +36061,7 @@
                 <w:sz w:val="18"/>
                 <w:szCs w:val="18"/>
               </w:rPr>
-              <w:t xml:space="preserve">Ksolves India Ltd</w:t>
+              <w:t xml:space="preserve">Balu Forge | Forging Ahead with Defense and Aerospace Ambitions Amid Capital Efficiency Concerns |</w:t>
             </w:r>
           </w:p>
         </w:tc>
@@ -36137,7 +36137,7 @@
                 <w:sz w:val="18"/>
                 <w:szCs w:val="18"/>
               </w:rPr>
-              <w:t xml:space="preserve">Godawari Power &amp; Ispat Ltd (GPIL)</w:t>
+              <w:t xml:space="preserve">Ksolves India Ltd</w:t>
             </w:r>
           </w:p>
         </w:tc>
@@ -36213,7 +36213,7 @@
                 <w:sz w:val="18"/>
                 <w:szCs w:val="18"/>
               </w:rPr>
-              <w:t xml:space="preserve">Gabriel India Ltd</w:t>
+              <w:t xml:space="preserve">Godawari Power &amp; Ispat Ltd (GPIL)</w:t>
             </w:r>
           </w:p>
         </w:tc>
@@ -36289,7 +36289,7 @@
                 <w:sz w:val="18"/>
                 <w:szCs w:val="18"/>
               </w:rPr>
-              <w:t xml:space="preserve">KPIT Technologies Ltd</w:t>
+              <w:t xml:space="preserve">Gabriel India Ltd</w:t>
             </w:r>
           </w:p>
         </w:tc>
@@ -36365,7 +36365,7 @@
                 <w:sz w:val="18"/>
                 <w:szCs w:val="18"/>
               </w:rPr>
-              <w:t xml:space="preserve">Firstsource Solutions Ltd</w:t>
+              <w:t xml:space="preserve">KPIT Technologies Ltd</w:t>
             </w:r>
           </w:p>
         </w:tc>
@@ -36441,7 +36441,7 @@
                 <w:sz w:val="18"/>
                 <w:szCs w:val="18"/>
               </w:rPr>
-              <w:t xml:space="preserve">Action Construction Equipment (ACE)</w:t>
+              <w:t xml:space="preserve">Firstsource Solutions Ltd</w:t>
             </w:r>
           </w:p>
         </w:tc>
@@ -36517,7 +36517,7 @@
                 <w:sz w:val="18"/>
                 <w:szCs w:val="18"/>
               </w:rPr>
-              <w:t xml:space="preserve">Waaree Energies Ltd.</w:t>
+              <w:t xml:space="preserve">Action Construction Equipment (ACE)</w:t>
             </w:r>
           </w:p>
         </w:tc>
@@ -36593,7 +36593,7 @@
                 <w:sz w:val="18"/>
                 <w:szCs w:val="18"/>
               </w:rPr>
-              <w:t xml:space="preserve">Kirloskar Oil Engines Ltd (KOEL)</w:t>
+              <w:t xml:space="preserve">Waaree Energies Ltd.</w:t>
             </w:r>
           </w:p>
         </w:tc>
@@ -36669,7 +36669,7 @@
                 <w:sz w:val="18"/>
                 <w:szCs w:val="18"/>
               </w:rPr>
-              <w:t xml:space="preserve">Artemis Medicare Services Ltd</w:t>
+              <w:t xml:space="preserve">Kirloskar Oil Engines Ltd (KOEL)</w:t>
             </w:r>
           </w:p>
         </w:tc>
@@ -36745,7 +36745,7 @@
                 <w:sz w:val="18"/>
                 <w:szCs w:val="18"/>
               </w:rPr>
-              <w:t xml:space="preserve">Venky India</w:t>
+              <w:t xml:space="preserve">Artemis Medicare Services Ltd</w:t>
             </w:r>
           </w:p>
         </w:tc>
@@ -36821,7 +36821,7 @@
                 <w:sz w:val="18"/>
                 <w:szCs w:val="18"/>
               </w:rPr>
-              <w:t xml:space="preserve">Kama Holdings Limited</w:t>
+              <w:t xml:space="preserve">Venky India</w:t>
             </w:r>
           </w:p>
         </w:tc>
@@ -36897,7 +36897,7 @@
                 <w:sz w:val="18"/>
                 <w:szCs w:val="18"/>
               </w:rPr>
-              <w:t xml:space="preserve">PTC Industries Ltd</w:t>
+              <w:t xml:space="preserve">Kama Holdings Limited</w:t>
             </w:r>
           </w:p>
         </w:tc>
@@ -36973,7 +36973,7 @@
                 <w:sz w:val="18"/>
                 <w:szCs w:val="18"/>
               </w:rPr>
-              <w:t xml:space="preserve">Ceigall India Ltd</w:t>
+              <w:t xml:space="preserve">PTC Industries Ltd</w:t>
             </w:r>
           </w:p>
         </w:tc>
@@ -37049,7 +37049,7 @@
                 <w:sz w:val="18"/>
                 <w:szCs w:val="18"/>
               </w:rPr>
-              <w:t xml:space="preserve">Travel Food Services Ltd</w:t>
+              <w:t xml:space="preserve">Ceigall India Ltd</w:t>
             </w:r>
           </w:p>
         </w:tc>
@@ -37125,7 +37125,7 @@
                 <w:sz w:val="18"/>
                 <w:szCs w:val="18"/>
               </w:rPr>
-              <w:t xml:space="preserve">Bharat Heavy Electricals Ltd (BHEL)</w:t>
+              <w:t xml:space="preserve">Travel Food Services Ltd</w:t>
             </w:r>
           </w:p>
         </w:tc>
@@ -37201,7 +37201,7 @@
                 <w:sz w:val="18"/>
                 <w:szCs w:val="18"/>
               </w:rPr>
-              <w:t xml:space="preserve">KEI Industries Ltd</w:t>
+              <w:t xml:space="preserve">Bharat Heavy Electricals Ltd (BHEL)</w:t>
             </w:r>
           </w:p>
         </w:tc>
@@ -37277,7 +37277,7 @@
                 <w:sz w:val="18"/>
                 <w:szCs w:val="18"/>
               </w:rPr>
-              <w:t xml:space="preserve">Escorts Kubota Ltd</w:t>
+              <w:t xml:space="preserve">KEI Industries Ltd</w:t>
             </w:r>
           </w:p>
         </w:tc>
@@ -37353,7 +37353,7 @@
                 <w:sz w:val="18"/>
                 <w:szCs w:val="18"/>
               </w:rPr>
-              <w:t xml:space="preserve">Ajax Engineering Ltd</w:t>
+              <w:t xml:space="preserve">Escorts Kubota Ltd</w:t>
             </w:r>
           </w:p>
         </w:tc>
@@ -37429,7 +37429,7 @@
                 <w:sz w:val="18"/>
                 <w:szCs w:val="18"/>
               </w:rPr>
-              <w:t xml:space="preserve">Flysbs</w:t>
+              <w:t xml:space="preserve">Ajax Engineering Ltd</w:t>
             </w:r>
           </w:p>
         </w:tc>
@@ -37505,7 +37505,7 @@
                 <w:sz w:val="18"/>
                 <w:szCs w:val="18"/>
               </w:rPr>
-              <w:t xml:space="preserve">Kody Technolabs</w:t>
+              <w:t xml:space="preserve">Flysbs</w:t>
             </w:r>
           </w:p>
         </w:tc>
@@ -37581,7 +37581,7 @@
                 <w:sz w:val="18"/>
                 <w:szCs w:val="18"/>
               </w:rPr>
-              <w:t xml:space="preserve">Cyient DLM</w:t>
+              <w:t xml:space="preserve">Kody Technolabs</w:t>
             </w:r>
           </w:p>
         </w:tc>
@@ -37657,7 +37657,7 @@
                 <w:sz w:val="18"/>
                 <w:szCs w:val="18"/>
               </w:rPr>
-              <w:t xml:space="preserve">APAR Industries</w:t>
+              <w:t xml:space="preserve">Cyient DLM</w:t>
             </w:r>
           </w:p>
         </w:tc>
@@ -37733,7 +37733,7 @@
                 <w:sz w:val="18"/>
                 <w:szCs w:val="18"/>
               </w:rPr>
-              <w:t xml:space="preserve">Titan</w:t>
+              <w:t xml:space="preserve">APAR Industries</w:t>
             </w:r>
           </w:p>
         </w:tc>
@@ -37809,7 +37809,7 @@
                 <w:sz w:val="18"/>
                 <w:szCs w:val="18"/>
               </w:rPr>
-              <w:t xml:space="preserve">Nykaa</w:t>
+              <w:t xml:space="preserve">Titan</w:t>
             </w:r>
           </w:p>
         </w:tc>
@@ -37885,7 +37885,7 @@
                 <w:sz w:val="18"/>
                 <w:szCs w:val="18"/>
               </w:rPr>
-              <w:t xml:space="preserve">Powerica Ltd</w:t>
+              <w:t xml:space="preserve">Nykaa</w:t>
             </w:r>
           </w:p>
         </w:tc>
@@ -37961,7 +37961,7 @@
                 <w:sz w:val="18"/>
                 <w:szCs w:val="18"/>
               </w:rPr>
-              <w:t xml:space="preserve">Rossell India / Rossell Techsys</w:t>
+              <w:t xml:space="preserve">Powerica Ltd</w:t>
             </w:r>
           </w:p>
         </w:tc>
@@ -38037,7 +38037,7 @@
                 <w:sz w:val="18"/>
                 <w:szCs w:val="18"/>
               </w:rPr>
-              <w:t xml:space="preserve">Indian Metals &amp; Ferro Alloys (IMFA)</w:t>
+              <w:t xml:space="preserve">Rossell India / Rossell Techsys</w:t>
             </w:r>
           </w:p>
         </w:tc>
@@ -38113,7 +38113,7 @@
                 <w:sz w:val="18"/>
                 <w:szCs w:val="18"/>
               </w:rPr>
-              <w:t xml:space="preserve">Bank of Maharashtra</w:t>
+              <w:t xml:space="preserve">Indian Metals &amp; Ferro Alloys (IMFA)</w:t>
             </w:r>
           </w:p>
         </w:tc>
@@ -38189,7 +38189,7 @@
                 <w:sz w:val="18"/>
                 <w:szCs w:val="18"/>
               </w:rPr>
-              <w:t xml:space="preserve">Nestle India</w:t>
+              <w:t xml:space="preserve">Bank of Maharashtra</w:t>
             </w:r>
           </w:p>
         </w:tc>
@@ -38265,7 +38265,7 @@
                 <w:sz w:val="18"/>
                 <w:szCs w:val="18"/>
               </w:rPr>
-              <w:t xml:space="preserve">GRT Jewellers (re TBZ acquisition)</w:t>
+              <w:t xml:space="preserve">Nestle India</w:t>
             </w:r>
           </w:p>
         </w:tc>
@@ -38341,7 +38341,7 @@
                 <w:sz w:val="18"/>
                 <w:szCs w:val="18"/>
               </w:rPr>
-              <w:t xml:space="preserve">Dee Development Engineers</w:t>
+              <w:t xml:space="preserve">GRT Jewellers (re TBZ acquisition)</w:t>
             </w:r>
           </w:p>
         </w:tc>
@@ -38417,7 +38417,7 @@
                 <w:sz w:val="18"/>
                 <w:szCs w:val="18"/>
               </w:rPr>
-              <w:t xml:space="preserve">HDFC AMC</w:t>
+              <w:t xml:space="preserve">Dee Development Engineers</w:t>
             </w:r>
           </w:p>
         </w:tc>
@@ -38493,7 +38493,7 @@
                 <w:sz w:val="18"/>
                 <w:szCs w:val="18"/>
               </w:rPr>
-              <w:t xml:space="preserve">Tata Motors Passenger Vehicles</w:t>
+              <w:t xml:space="preserve">HDFC AMC</w:t>
             </w:r>
           </w:p>
         </w:tc>
@@ -38569,7 +38569,7 @@
                 <w:sz w:val="18"/>
                 <w:szCs w:val="18"/>
               </w:rPr>
-              <w:t xml:space="preserve">SBI Funds Management</w:t>
+              <w:t xml:space="preserve">Tata Motors Passenger Vehicles</w:t>
             </w:r>
           </w:p>
         </w:tc>
@@ -38645,7 +38645,7 @@
                 <w:sz w:val="18"/>
                 <w:szCs w:val="18"/>
               </w:rPr>
-              <w:t xml:space="preserve">Mahanagar Gas (MGL)</w:t>
+              <w:t xml:space="preserve">SBI Funds Management</w:t>
             </w:r>
           </w:p>
         </w:tc>
@@ -38721,7 +38721,7 @@
                 <w:sz w:val="18"/>
                 <w:szCs w:val="18"/>
               </w:rPr>
-              <w:t xml:space="preserve">Coforge</w:t>
+              <w:t xml:space="preserve">Mahanagar Gas (MGL)</w:t>
             </w:r>
           </w:p>
         </w:tc>
@@ -38797,7 +38797,7 @@
                 <w:sz w:val="18"/>
                 <w:szCs w:val="18"/>
               </w:rPr>
-              <w:t xml:space="preserve">Embassy REIT</w:t>
+              <w:t xml:space="preserve">Coforge</w:t>
             </w:r>
           </w:p>
         </w:tc>
@@ -38873,7 +38873,7 @@
                 <w:sz w:val="18"/>
                 <w:szCs w:val="18"/>
               </w:rPr>
-              <w:t xml:space="preserve">Shilchar Technologies</w:t>
+              <w:t xml:space="preserve">Embassy REIT</w:t>
             </w:r>
           </w:p>
         </w:tc>
@@ -38949,7 +38949,7 @@
                 <w:sz w:val="18"/>
                 <w:szCs w:val="18"/>
               </w:rPr>
-              <w:t xml:space="preserve">Eicher Motors (VECV heavy trucks)</w:t>
+              <w:t xml:space="preserve">Shilchar Technologies</w:t>
             </w:r>
           </w:p>
         </w:tc>
@@ -39025,7 +39025,7 @@
                 <w:sz w:val="18"/>
                 <w:szCs w:val="18"/>
               </w:rPr>
-              <w:t xml:space="preserve">State Bank of India</w:t>
+              <w:t xml:space="preserve">Eicher Motors (VECV heavy trucks)</w:t>
             </w:r>
           </w:p>
         </w:tc>
@@ -39101,7 +39101,7 @@
                 <w:sz w:val="18"/>
                 <w:szCs w:val="18"/>
               </w:rPr>
-              <w:t xml:space="preserve">Cholamandalam Investment and Finance</w:t>
+              <w:t xml:space="preserve">State Bank of India</w:t>
             </w:r>
           </w:p>
         </w:tc>
@@ -39177,7 +39177,7 @@
                 <w:sz w:val="18"/>
                 <w:szCs w:val="18"/>
               </w:rPr>
-              <w:t xml:space="preserve">Shriram Finance</w:t>
+              <w:t xml:space="preserve">Cholamandalam Investment and Finance</w:t>
             </w:r>
           </w:p>
         </w:tc>
@@ -39253,7 +39253,7 @@
                 <w:sz w:val="18"/>
                 <w:szCs w:val="18"/>
               </w:rPr>
-              <w:t xml:space="preserve">Shankesh Jewellers</w:t>
+              <w:t xml:space="preserve">Shriram Finance</w:t>
             </w:r>
           </w:p>
         </w:tc>
@@ -39329,7 +39329,7 @@
                 <w:sz w:val="18"/>
                 <w:szCs w:val="18"/>
               </w:rPr>
-              <w:t xml:space="preserve">Kingfa Science and Technology</w:t>
+              <w:t xml:space="preserve">Shankesh Jewellers</w:t>
             </w:r>
           </w:p>
         </w:tc>
@@ -39405,7 +39405,7 @@
                 <w:sz w:val="18"/>
                 <w:szCs w:val="18"/>
               </w:rPr>
-              <w:t xml:space="preserve">IPCA Labs</w:t>
+              <w:t xml:space="preserve">Kingfa Science and Technology</w:t>
             </w:r>
           </w:p>
         </w:tc>
@@ -39481,7 +39481,7 @@
                 <w:sz w:val="18"/>
                 <w:szCs w:val="18"/>
               </w:rPr>
-              <w:t xml:space="preserve">Navin Fluorine International Ltd</w:t>
+              <w:t xml:space="preserve">IPCA Labs</w:t>
             </w:r>
           </w:p>
         </w:tc>
@@ -39500,7 +39500,7 @@
                 <w:sz w:val="18"/>
                 <w:szCs w:val="18"/>
               </w:rPr>
-              <w:t xml:space="preserve">24.25</w:t>
+              <w:t xml:space="preserve">25</w:t>
             </w:r>
           </w:p>
         </w:tc>
@@ -39518,7 +39518,7 @@
                 <w:sz w:val="18"/>
                 <w:szCs w:val="18"/>
               </w:rPr>
-              <w:t xml:space="preserve">Low-Medium</w:t>
+              <w:t xml:space="preserve">Medium</w:t>
             </w:r>
           </w:p>
         </w:tc>
@@ -39557,7 +39557,7 @@
                 <w:sz w:val="18"/>
                 <w:szCs w:val="18"/>
               </w:rPr>
-              <w:t xml:space="preserve">Eldeco Housing Ltd</w:t>
+              <w:t xml:space="preserve">Navin Fluorine International Ltd</w:t>
             </w:r>
           </w:p>
         </w:tc>
@@ -39576,7 +39576,7 @@
                 <w:sz w:val="18"/>
                 <w:szCs w:val="18"/>
               </w:rPr>
-              <w:t xml:space="preserve">23.19</w:t>
+              <w:t xml:space="preserve">24.25</w:t>
             </w:r>
           </w:p>
         </w:tc>
@@ -39594,7 +39594,7 @@
                 <w:sz w:val="18"/>
                 <w:szCs w:val="18"/>
               </w:rPr>
-              <w:t xml:space="preserve">Low</w:t>
+              <w:t xml:space="preserve">Low-Medium</w:t>
             </w:r>
           </w:p>
         </w:tc>
@@ -39613,7 +39613,7 @@
                 <w:sz w:val="18"/>
                 <w:szCs w:val="18"/>
               </w:rPr>
-              <w:t xml:space="preserve">10x-in-2-3-years</w:t>
+              <w:t xml:space="preserve">neither</w:t>
             </w:r>
           </w:p>
         </w:tc>
@@ -39633,7 +39633,7 @@
                 <w:sz w:val="18"/>
                 <w:szCs w:val="18"/>
               </w:rPr>
-              <w:t xml:space="preserve">MOIL Ltd</w:t>
+              <w:t xml:space="preserve">Eldeco Housing Ltd</w:t>
             </w:r>
           </w:p>
         </w:tc>
@@ -39652,7 +39652,7 @@
                 <w:sz w:val="18"/>
                 <w:szCs w:val="18"/>
               </w:rPr>
-              <w:t xml:space="preserve">23.03</w:t>
+              <w:t xml:space="preserve">23.19</w:t>
             </w:r>
           </w:p>
         </w:tc>
@@ -39709,7 +39709,7 @@
                 <w:sz w:val="18"/>
                 <w:szCs w:val="18"/>
               </w:rPr>
-              <w:t xml:space="preserve">PNGS Gargi Fashion Jewellery Ltd</w:t>
+              <w:t xml:space="preserve">MOIL Ltd</w:t>
             </w:r>
           </w:p>
         </w:tc>
@@ -39728,7 +39728,7 @@
                 <w:sz w:val="18"/>
                 <w:szCs w:val="18"/>
               </w:rPr>
-              <w:t xml:space="preserve">22</w:t>
+              <w:t xml:space="preserve">23.03</w:t>
             </w:r>
           </w:p>
         </w:tc>
@@ -39785,7 +39785,7 @@
                 <w:sz w:val="18"/>
                 <w:szCs w:val="18"/>
               </w:rPr>
-              <w:t xml:space="preserve">Laxmi Dental Ltd</w:t>
+              <w:t xml:space="preserve">PNGS Gargi Fashion Jewellery Ltd</w:t>
             </w:r>
           </w:p>
         </w:tc>
@@ -39861,7 +39861,7 @@
                 <w:sz w:val="18"/>
                 <w:szCs w:val="18"/>
               </w:rPr>
-              <w:t xml:space="preserve">Borana Weaves</w:t>
+              <w:t xml:space="preserve">Laxmi Dental Ltd</w:t>
             </w:r>
           </w:p>
         </w:tc>
@@ -39937,7 +39937,7 @@
                 <w:sz w:val="18"/>
                 <w:szCs w:val="18"/>
               </w:rPr>
-              <w:t xml:space="preserve">Repco Home Finance</w:t>
+              <w:t xml:space="preserve">Borana Weaves</w:t>
             </w:r>
           </w:p>
         </w:tc>
@@ -39974,7 +39974,7 @@
                 <w:sz w:val="18"/>
                 <w:szCs w:val="18"/>
               </w:rPr>
-              <w:t xml:space="preserve">Low-Medium</w:t>
+              <w:t xml:space="preserve">Low</w:t>
             </w:r>
           </w:p>
         </w:tc>
@@ -39993,7 +39993,7 @@
                 <w:sz w:val="18"/>
                 <w:szCs w:val="18"/>
               </w:rPr>
-              <w:t xml:space="preserve">neither</w:t>
+              <w:t xml:space="preserve">10x-in-2-3-years</w:t>
             </w:r>
           </w:p>
         </w:tc>
@@ -40013,7 +40013,7 @@
                 <w:sz w:val="18"/>
                 <w:szCs w:val="18"/>
               </w:rPr>
-              <w:t xml:space="preserve">Solarium Green Energy Ltd</w:t>
+              <w:t xml:space="preserve">Repco Home Finance</w:t>
             </w:r>
           </w:p>
         </w:tc>
@@ -40050,7 +40050,7 @@
                 <w:sz w:val="18"/>
                 <w:szCs w:val="18"/>
               </w:rPr>
-              <w:t xml:space="preserve">Low</w:t>
+              <w:t xml:space="preserve">Low-Medium</w:t>
             </w:r>
           </w:p>
         </w:tc>
@@ -40069,7 +40069,7 @@
                 <w:sz w:val="18"/>
                 <w:szCs w:val="18"/>
               </w:rPr>
-              <w:t xml:space="preserve">10x-in-2-3-years</w:t>
+              <w:t xml:space="preserve">neither</w:t>
             </w:r>
           </w:p>
         </w:tc>
@@ -40089,7 +40089,7 @@
                 <w:sz w:val="18"/>
                 <w:szCs w:val="18"/>
               </w:rPr>
-              <w:t xml:space="preserve">HDFC Bank Ltd</w:t>
+              <w:t xml:space="preserve">Solarium Green Energy Ltd</w:t>
             </w:r>
           </w:p>
         </w:tc>
@@ -40108,7 +40108,7 @@
                 <w:sz w:val="18"/>
                 <w:szCs w:val="18"/>
               </w:rPr>
-              <w:t xml:space="preserve">20.12</w:t>
+              <w:t xml:space="preserve">22</w:t>
             </w:r>
           </w:p>
         </w:tc>
@@ -40126,7 +40126,7 @@
                 <w:sz w:val="18"/>
                 <w:szCs w:val="18"/>
               </w:rPr>
-              <w:t xml:space="preserve">Low-Medium</w:t>
+              <w:t xml:space="preserve">Low</w:t>
             </w:r>
           </w:p>
         </w:tc>
@@ -40145,7 +40145,7 @@
                 <w:sz w:val="18"/>
                 <w:szCs w:val="18"/>
               </w:rPr>
-              <w:t xml:space="preserve">neither</w:t>
+              <w:t xml:space="preserve">10x-in-2-3-years</w:t>
             </w:r>
           </w:p>
         </w:tc>
@@ -40165,7 +40165,7 @@
                 <w:sz w:val="18"/>
                 <w:szCs w:val="18"/>
               </w:rPr>
-              <w:t xml:space="preserve">Novartis India Ltd</w:t>
+              <w:t xml:space="preserve">HDFC Bank Ltd</w:t>
             </w:r>
           </w:p>
         </w:tc>
@@ -40184,7 +40184,7 @@
                 <w:sz w:val="18"/>
                 <w:szCs w:val="18"/>
               </w:rPr>
-              <w:t xml:space="preserve">20</w:t>
+              <w:t xml:space="preserve">20.12</w:t>
             </w:r>
           </w:p>
         </w:tc>
@@ -40202,7 +40202,7 @@
                 <w:sz w:val="18"/>
                 <w:szCs w:val="18"/>
               </w:rPr>
-              <w:t xml:space="preserve">Medium</w:t>
+              <w:t xml:space="preserve">Low-Medium</w:t>
             </w:r>
           </w:p>
         </w:tc>
@@ -40241,7 +40241,7 @@
                 <w:sz w:val="18"/>
                 <w:szCs w:val="18"/>
               </w:rPr>
-              <w:t xml:space="preserve">Vintage Coffee: Brewing Profits</w:t>
+              <w:t xml:space="preserve">Novartis India Ltd</w:t>
             </w:r>
           </w:p>
         </w:tc>
@@ -40260,7 +40260,7 @@
                 <w:sz w:val="18"/>
                 <w:szCs w:val="18"/>
               </w:rPr>
-              <w:t xml:space="preserve">18.76</w:t>
+              <w:t xml:space="preserve">20</w:t>
             </w:r>
           </w:p>
         </w:tc>
@@ -40297,7 +40297,7 @@
                 <w:sz w:val="18"/>
                 <w:szCs w:val="18"/>
               </w:rPr>
-              <w:t xml:space="preserve">10x-in-2-3-years</w:t>
+              <w:t xml:space="preserve">neither</w:t>
             </w:r>
           </w:p>
         </w:tc>
@@ -40317,7 +40317,7 @@
                 <w:sz w:val="18"/>
                 <w:szCs w:val="18"/>
               </w:rPr>
-              <w:t xml:space="preserve">GE Vernova T&amp;D India Ltd</w:t>
+              <w:t xml:space="preserve">Vintage Coffee: Brewing Profits</w:t>
             </w:r>
           </w:p>
         </w:tc>
@@ -40336,7 +40336,7 @@
                 <w:sz w:val="18"/>
                 <w:szCs w:val="18"/>
               </w:rPr>
-              <w:t xml:space="preserve">18.7</w:t>
+              <w:t xml:space="preserve">18.76</w:t>
             </w:r>
           </w:p>
         </w:tc>
@@ -40354,7 +40354,7 @@
                 <w:sz w:val="18"/>
                 <w:szCs w:val="18"/>
               </w:rPr>
-              <w:t xml:space="preserve">Low-Medium</w:t>
+              <w:t xml:space="preserve">Medium</w:t>
             </w:r>
           </w:p>
         </w:tc>
@@ -40373,7 +40373,7 @@
                 <w:sz w:val="18"/>
                 <w:szCs w:val="18"/>
               </w:rPr>
-              <w:t xml:space="preserve">neither</w:t>
+              <w:t xml:space="preserve">10x-in-2-3-years</w:t>
             </w:r>
           </w:p>
         </w:tc>
@@ -40393,7 +40393,7 @@
                 <w:sz w:val="18"/>
                 <w:szCs w:val="18"/>
               </w:rPr>
-              <w:t xml:space="preserve">Aurionpro Solutions Ltd</w:t>
+              <w:t xml:space="preserve">GE Vernova T&amp;D India Ltd</w:t>
             </w:r>
           </w:p>
         </w:tc>
@@ -40412,7 +40412,7 @@
                 <w:sz w:val="18"/>
                 <w:szCs w:val="18"/>
               </w:rPr>
-              <w:t xml:space="preserve">18.62</w:t>
+              <w:t xml:space="preserve">18.7</w:t>
             </w:r>
           </w:p>
         </w:tc>
@@ -40469,7 +40469,7 @@
                 <w:sz w:val="18"/>
                 <w:szCs w:val="18"/>
               </w:rPr>
-              <w:t xml:space="preserve">Mankind Pharma</w:t>
+              <w:t xml:space="preserve">Aurionpro Solutions Ltd</w:t>
             </w:r>
           </w:p>
         </w:tc>
@@ -40488,7 +40488,7 @@
                 <w:sz w:val="18"/>
                 <w:szCs w:val="18"/>
               </w:rPr>
-              <w:t xml:space="preserve">18.06</w:t>
+              <w:t xml:space="preserve">18.62</w:t>
             </w:r>
           </w:p>
         </w:tc>
@@ -40545,7 +40545,7 @@
                 <w:sz w:val="18"/>
                 <w:szCs w:val="18"/>
               </w:rPr>
-              <w:t xml:space="preserve">Medplus Health Service second largest pharmacy retailer</w:t>
+              <w:t xml:space="preserve">Mankind Pharma</w:t>
             </w:r>
           </w:p>
         </w:tc>
@@ -40564,7 +40564,7 @@
                 <w:sz w:val="18"/>
                 <w:szCs w:val="18"/>
               </w:rPr>
-              <w:t xml:space="preserve">17.65</w:t>
+              <w:t xml:space="preserve">18.06</w:t>
             </w:r>
           </w:p>
         </w:tc>
@@ -40621,7 +40621,7 @@
                 <w:sz w:val="18"/>
                 <w:szCs w:val="18"/>
               </w:rPr>
-              <w:t xml:space="preserve">Saregama India Ltd</w:t>
+              <w:t xml:space="preserve">Medplus Health Service second largest pharmacy retailer</w:t>
             </w:r>
           </w:p>
         </w:tc>
@@ -40697,7 +40697,7 @@
                 <w:sz w:val="18"/>
                 <w:szCs w:val="18"/>
               </w:rPr>
-              <w:t xml:space="preserve">Strides Pharma Science Ltd</w:t>
+              <w:t xml:space="preserve">Saregama India Ltd</w:t>
             </w:r>
           </w:p>
         </w:tc>
@@ -40773,7 +40773,7 @@
                 <w:sz w:val="18"/>
                 <w:szCs w:val="18"/>
               </w:rPr>
-              <w:t xml:space="preserve">Latent View Analytics Ltd</w:t>
+              <w:t xml:space="preserve">Strides Pharma Science Ltd</w:t>
             </w:r>
           </w:p>
         </w:tc>
@@ -40849,7 +40849,7 @@
                 <w:sz w:val="18"/>
                 <w:szCs w:val="18"/>
               </w:rPr>
-              <w:t xml:space="preserve">Shree Pushkar Chemicals Ltd</w:t>
+              <w:t xml:space="preserve">Latent View Analytics Ltd</w:t>
             </w:r>
           </w:p>
         </w:tc>
@@ -40868,7 +40868,7 @@
                 <w:sz w:val="18"/>
                 <w:szCs w:val="18"/>
               </w:rPr>
-              <w:t xml:space="preserve">16.83</w:t>
+              <w:t xml:space="preserve">17.65</w:t>
             </w:r>
           </w:p>
         </w:tc>
@@ -40925,7 +40925,7 @@
                 <w:sz w:val="18"/>
                 <w:szCs w:val="18"/>
               </w:rPr>
-              <w:t xml:space="preserve">INOX Wind</w:t>
+              <w:t xml:space="preserve">Shree Pushkar Chemicals Ltd</w:t>
             </w:r>
           </w:p>
         </w:tc>
@@ -41001,7 +41001,7 @@
                 <w:sz w:val="18"/>
                 <w:szCs w:val="18"/>
               </w:rPr>
-              <w:t xml:space="preserve">Monolithish Ltd</w:t>
+              <w:t xml:space="preserve">INOX Wind</w:t>
             </w:r>
           </w:p>
         </w:tc>
@@ -41077,7 +41077,7 @@
                 <w:sz w:val="18"/>
                 <w:szCs w:val="18"/>
               </w:rPr>
-              <w:t xml:space="preserve">Asarfi Hospital Limited SME IPO (Asarfi Hospital IPO)</w:t>
+              <w:t xml:space="preserve">Monolithish Ltd</w:t>
             </w:r>
           </w:p>
         </w:tc>
@@ -41153,7 +41153,7 @@
                 <w:sz w:val="18"/>
                 <w:szCs w:val="18"/>
               </w:rPr>
-              <w:t xml:space="preserve">Stallion India Fluorochemicals : Aggressive Capex</w:t>
+              <w:t xml:space="preserve">Asarfi Hospital Limited SME IPO (Asarfi Hospital IPO)</w:t>
             </w:r>
           </w:p>
         </w:tc>
@@ -41172,7 +41172,7 @@
                 <w:sz w:val="18"/>
                 <w:szCs w:val="18"/>
               </w:rPr>
-              <w:t xml:space="preserve">16.81</w:t>
+              <w:t xml:space="preserve">16.83</w:t>
             </w:r>
           </w:p>
         </w:tc>
@@ -41190,7 +41190,7 @@
                 <w:sz w:val="18"/>
                 <w:szCs w:val="18"/>
               </w:rPr>
-              <w:t xml:space="preserve">Medium</w:t>
+              <w:t xml:space="preserve">Low-Medium</w:t>
             </w:r>
           </w:p>
         </w:tc>
@@ -41209,7 +41209,7 @@
                 <w:sz w:val="18"/>
                 <w:szCs w:val="18"/>
               </w:rPr>
-              <w:t xml:space="preserve">10x-in-2-3-years</w:t>
+              <w:t xml:space="preserve">neither</w:t>
             </w:r>
           </w:p>
         </w:tc>
@@ -41229,7 +41229,7 @@
                 <w:sz w:val="18"/>
                 <w:szCs w:val="18"/>
               </w:rPr>
-              <w:t xml:space="preserve">Uno Minda Ltd</w:t>
+              <w:t xml:space="preserve">Stallion India Fluorochemicals : Aggressive Capex</w:t>
             </w:r>
           </w:p>
         </w:tc>
@@ -41248,7 +41248,7 @@
                 <w:sz w:val="18"/>
                 <w:szCs w:val="18"/>
               </w:rPr>
-              <w:t xml:space="preserve">16.41</w:t>
+              <w:t xml:space="preserve">16.81</w:t>
             </w:r>
           </w:p>
         </w:tc>
@@ -41266,7 +41266,7 @@
                 <w:sz w:val="18"/>
                 <w:szCs w:val="18"/>
               </w:rPr>
-              <w:t xml:space="preserve">Low-Medium</w:t>
+              <w:t xml:space="preserve">Medium</w:t>
             </w:r>
           </w:p>
         </w:tc>
@@ -41285,7 +41285,7 @@
                 <w:sz w:val="18"/>
                 <w:szCs w:val="18"/>
               </w:rPr>
-              <w:t xml:space="preserve">neither</w:t>
+              <w:t xml:space="preserve">10x-in-2-3-years</w:t>
             </w:r>
           </w:p>
         </w:tc>

</xml_diff>